<commit_message>
Display de 7 segmentos e sensores ultrassonico e ldr
</commit_message>
<xml_diff>
--- a/Display de 7 Segmentos.docx
+++ b/Display de 7 Segmentos.docx
@@ -268,17 +268,75 @@
     </w:p>
     <w:p>
       <w:pPr>
-        <w:rPr>
-          <w:b/>
-          <w:bCs/>
-        </w:rPr>
-      </w:pPr>
-      <w:r>
-        <w:rPr>
-          <w:b/>
-          <w:bCs/>
+        <w:jc w:val="center"/>
+      </w:pPr>
+      <w:r>
+        <w:rPr>
+          <w:noProof/>
         </w:rPr>
         <w:lastRenderedPageBreak/>
+        <w:drawing>
+          <wp:inline distT="0" distB="0" distL="0" distR="0" wp14:anchorId="2F51F511" wp14:editId="2C5A1F42">
+            <wp:extent cx="2828925" cy="1895475"/>
+            <wp:effectExtent l="0" t="0" r="9525" b="9525"/>
+            <wp:docPr id="651799074" name="Imagem 1" descr="Display 7 Segmentos Arduino: Tutorial para Projetos - Blog ..."/>
+            <wp:cNvGraphicFramePr>
+              <a:graphicFrameLocks xmlns:a="http://schemas.openxmlformats.org/drawingml/2006/main" noChangeAspect="1"/>
+            </wp:cNvGraphicFramePr>
+            <a:graphic xmlns:a="http://schemas.openxmlformats.org/drawingml/2006/main">
+              <a:graphicData uri="http://schemas.openxmlformats.org/drawingml/2006/picture">
+                <pic:pic xmlns:pic="http://schemas.openxmlformats.org/drawingml/2006/picture">
+                  <pic:nvPicPr>
+                    <pic:cNvPr id="0" name="Picture 4" descr="Display 7 Segmentos Arduino: Tutorial para Projetos - Blog ..."/>
+                    <pic:cNvPicPr>
+                      <a:picLocks noChangeAspect="1" noChangeArrowheads="1"/>
+                    </pic:cNvPicPr>
+                  </pic:nvPicPr>
+                  <pic:blipFill>
+                    <a:blip r:embed="rId8">
+                      <a:extLst>
+                        <a:ext uri="{28A0092B-C50C-407E-A947-70E740481C1C}">
+                          <a14:useLocalDpi xmlns:a14="http://schemas.microsoft.com/office/drawing/2010/main" val="0"/>
+                        </a:ext>
+                      </a:extLst>
+                    </a:blip>
+                    <a:srcRect/>
+                    <a:stretch>
+                      <a:fillRect/>
+                    </a:stretch>
+                  </pic:blipFill>
+                  <pic:spPr bwMode="auto">
+                    <a:xfrm>
+                      <a:off x="0" y="0"/>
+                      <a:ext cx="2828925" cy="1895475"/>
+                    </a:xfrm>
+                    <a:prstGeom prst="rect">
+                      <a:avLst/>
+                    </a:prstGeom>
+                    <a:noFill/>
+                    <a:ln>
+                      <a:noFill/>
+                    </a:ln>
+                  </pic:spPr>
+                </pic:pic>
+              </a:graphicData>
+            </a:graphic>
+          </wp:inline>
+        </w:drawing>
+      </w:r>
+    </w:p>
+    <w:p>
+      <w:pPr>
+        <w:rPr>
+          <w:b/>
+          <w:bCs/>
+        </w:rPr>
+      </w:pPr>
+      <w:r>
+        <w:rPr>
+          <w:b/>
+          <w:bCs/>
+        </w:rPr>
         <w:t>3. Tipos de Displays (Polaridade)</w:t>
       </w:r>
     </w:p>
@@ -386,7 +444,7 @@
                     </pic:cNvPicPr>
                   </pic:nvPicPr>
                   <pic:blipFill>
-                    <a:blip r:embed="rId8">
+                    <a:blip r:embed="rId9">
                       <a:extLst>
                         <a:ext uri="{28A0092B-C50C-407E-A947-70E740481C1C}">
                           <a14:useLocalDpi xmlns:a14="http://schemas.microsoft.com/office/drawing/2010/main" val="0"/>
@@ -439,7 +497,7 @@
                     </pic:cNvPicPr>
                   </pic:nvPicPr>
                   <pic:blipFill>
-                    <a:blip r:embed="rId9">
+                    <a:blip r:embed="rId10">
                       <a:extLst>
                         <a:ext uri="{28A0092B-C50C-407E-A947-70E740481C1C}">
                           <a14:useLocalDpi xmlns:a14="http://schemas.microsoft.com/office/drawing/2010/main" val="0"/>
@@ -516,7 +574,7 @@
     <w:p>
       <w:r>
         <w:pict w14:anchorId="23DBB74E">
-          <v:rect id="_x0000_i1043" style="width:0;height:1.5pt" o:hralign="center" o:hrstd="t" o:hr="t" fillcolor="#a0a0a0" stroked="f"/>
+          <v:rect id="_x0000_i1025" style="width:0;height:1.5pt" o:hralign="center" o:hrstd="t" o:hr="t" fillcolor="#a0a0a0" stroked="f"/>
         </w:pict>
       </w:r>
     </w:p>
@@ -625,6 +683,7 @@
                 <w:b/>
                 <w:bCs/>
               </w:rPr>
+              <w:lastRenderedPageBreak/>
               <w:t>Número</w:t>
             </w:r>
           </w:p>
@@ -1247,7 +1306,7 @@
     <w:p>
       <w:r>
         <w:pict w14:anchorId="3F13F3F1">
-          <v:rect id="_x0000_i1044" style="width:0;height:1.5pt" o:hralign="center" o:hrstd="t" o:hr="t" fillcolor="#a0a0a0" stroked="f"/>
+          <v:rect id="_x0000_i1026" style="width:0;height:1.5pt" o:hralign="center" o:hrstd="t" o:hr="t" fillcolor="#a0a0a0" stroked="f"/>
         </w:pict>
       </w:r>
     </w:p>
@@ -1271,7 +1330,6 @@
           <w:b/>
           <w:bCs/>
         </w:rPr>
-        <w:lastRenderedPageBreak/>
         <w:t>Montagem</w:t>
       </w:r>
     </w:p>
@@ -1304,7 +1362,7 @@
                     </pic:cNvPicPr>
                   </pic:nvPicPr>
                   <pic:blipFill>
-                    <a:blip r:embed="rId10">
+                    <a:blip r:embed="rId11">
                       <a:extLst>
                         <a:ext uri="{28A0092B-C50C-407E-A947-70E740481C1C}">
                           <a14:useLocalDpi xmlns:a14="http://schemas.microsoft.com/office/drawing/2010/main" val="0"/>
@@ -1343,6 +1401,67 @@
           <w:bCs/>
         </w:rPr>
       </w:pPr>
+      <w:r>
+        <w:rPr>
+          <w:noProof/>
+        </w:rPr>
+        <w:drawing>
+          <wp:inline distT="0" distB="0" distL="0" distR="0" wp14:anchorId="00EFCD1A" wp14:editId="59AB8794">
+            <wp:extent cx="3276600" cy="1390650"/>
+            <wp:effectExtent l="0" t="0" r="0" b="0"/>
+            <wp:docPr id="1913468618" name="Imagem 1" descr="Sistema digital: Semaforo con indicador de cuenta regresiva"/>
+            <wp:cNvGraphicFramePr>
+              <a:graphicFrameLocks xmlns:a="http://schemas.openxmlformats.org/drawingml/2006/main" noChangeAspect="1"/>
+            </wp:cNvGraphicFramePr>
+            <a:graphic xmlns:a="http://schemas.openxmlformats.org/drawingml/2006/main">
+              <a:graphicData uri="http://schemas.openxmlformats.org/drawingml/2006/picture">
+                <pic:pic xmlns:pic="http://schemas.openxmlformats.org/drawingml/2006/picture">
+                  <pic:nvPicPr>
+                    <pic:cNvPr id="0" name="Picture 4" descr="Sistema digital: Semaforo con indicador de cuenta regresiva"/>
+                    <pic:cNvPicPr>
+                      <a:picLocks noChangeAspect="1" noChangeArrowheads="1"/>
+                    </pic:cNvPicPr>
+                  </pic:nvPicPr>
+                  <pic:blipFill>
+                    <a:blip r:embed="rId12">
+                      <a:extLst>
+                        <a:ext uri="{28A0092B-C50C-407E-A947-70E740481C1C}">
+                          <a14:useLocalDpi xmlns:a14="http://schemas.microsoft.com/office/drawing/2010/main" val="0"/>
+                        </a:ext>
+                      </a:extLst>
+                    </a:blip>
+                    <a:srcRect/>
+                    <a:stretch>
+                      <a:fillRect/>
+                    </a:stretch>
+                  </pic:blipFill>
+                  <pic:spPr bwMode="auto">
+                    <a:xfrm>
+                      <a:off x="0" y="0"/>
+                      <a:ext cx="3276600" cy="1390650"/>
+                    </a:xfrm>
+                    <a:prstGeom prst="rect">
+                      <a:avLst/>
+                    </a:prstGeom>
+                    <a:noFill/>
+                    <a:ln>
+                      <a:noFill/>
+                    </a:ln>
+                  </pic:spPr>
+                </pic:pic>
+              </a:graphicData>
+            </a:graphic>
+          </wp:inline>
+        </w:drawing>
+      </w:r>
+    </w:p>
+    <w:p>
+      <w:pPr>
+        <w:rPr>
+          <w:b/>
+          <w:bCs/>
+        </w:rPr>
+      </w:pPr>
     </w:p>
     <w:p>
       <w:pPr>
@@ -1429,6 +1548,7 @@
           <w:b/>
           <w:bCs/>
         </w:rPr>
+        <w:lastRenderedPageBreak/>
         <w:t>Exercício 3:</w:t>
       </w:r>
       <w:r>
@@ -1557,7 +1677,7 @@
     <w:p>
       <w:r>
         <w:pict w14:anchorId="7B823EC3">
-          <v:rect id="_x0000_i1045" style="width:0;height:1.5pt" o:hralign="center" o:hrstd="t" o:hr="t" fillcolor="#a0a0a0" stroked="f"/>
+          <v:rect id="_x0000_i1027" style="width:0;height:1.5pt" o:hralign="center" o:hrstd="t" o:hr="t" fillcolor="#a0a0a0" stroked="f"/>
         </w:pict>
       </w:r>
     </w:p>
@@ -1577,7 +1697,6 @@
           <w:iCs/>
           <w:highlight w:val="black"/>
         </w:rPr>
-        <w:lastRenderedPageBreak/>
         <w:t>Para Anodo Comum, o nível lógico para ACENDER é 0 (LOW). Portanto: a, b, c = 0. Os demais (d, e, f, g) = 1 (HIGH) para ficarem apagados.</w:t>
       </w:r>
     </w:p>
@@ -2676,6 +2795,7 @@
   <w:style w:type="character" w:default="1" w:styleId="Fontepargpadro">
     <w:name w:val="Default Paragraph Font"/>
     <w:uiPriority w:val="1"/>
+    <w:semiHidden/>
     <w:unhideWhenUsed/>
   </w:style>
   <w:style w:type="table" w:default="1" w:styleId="Tabelanormal">

</xml_diff>